<commit_message>
Renamed "SI Table I" to "Table SI"
</commit_message>
<xml_diff>
--- a/SI.docx
+++ b/SI.docx
@@ -185,7 +185,23 @@
           <w:bCs/>
           <w:color w:val="156082" w:themeColor="accent1"/>
         </w:rPr>
-        <w:t>SI Table I. Energetics of Defect Structures in Monolayer MoS</w:t>
+        <w:t xml:space="preserve">Table </w:t>
+      </w:r>
+      <w:r>
+        <w:rPr>
+          <w:b/>
+          <w:bCs/>
+          <w:color w:val="156082" w:themeColor="accent1"/>
+        </w:rPr>
+        <w:t>S</w:t>
+      </w:r>
+      <w:r>
+        <w:rPr>
+          <w:b/>
+          <w:bCs/>
+          <w:color w:val="156082" w:themeColor="accent1"/>
+        </w:rPr>
+        <w:t>I. Energetics of Defect Structures in Monolayer MoS</w:t>
       </w:r>
       <w:r>
         <w:rPr>
@@ -5689,6 +5705,23 @@
 </file>
 
 <file path=customXml/item1.xml><?xml version="1.0" encoding="utf-8"?>
+<?mso-contentType ?>
+<FormTemplates xmlns="http://schemas.microsoft.com/sharepoint/v3/contenttype/forms">
+  <Display>DocumentLibraryForm</Display>
+  <Edit>DocumentLibraryForm</Edit>
+  <New>DocumentLibraryForm</New>
+</FormTemplates>
+</file>
+
+<file path=customXml/item2.xml><?xml version="1.0" encoding="utf-8"?>
+<p:properties xmlns:p="http://schemas.microsoft.com/office/2006/metadata/properties" xmlns:xsi="http://www.w3.org/2001/XMLSchema-instance" xmlns:pc="http://schemas.microsoft.com/office/infopath/2007/PartnerControls">
+  <documentManagement>
+    <_activity xmlns="e5940136-3a96-421c-8544-2602b63fadb2" xsi:nil="true"/>
+  </documentManagement>
+</p:properties>
+</file>
+
+<file path=customXml/item3.xml><?xml version="1.0" encoding="utf-8"?>
 <ct:contentTypeSchema xmlns:ct="http://schemas.microsoft.com/office/2006/metadata/contentType" xmlns:ma="http://schemas.microsoft.com/office/2006/metadata/properties/metaAttributes" ct:_="" ma:_="" ma:contentTypeName="Document" ma:contentTypeID="0x010100CA627D184E5B51479AD8C9EBF9AFA38C" ma:contentTypeVersion="19" ma:contentTypeDescription="Create a new document." ma:contentTypeScope="" ma:versionID="f611db6e3e10ea79f01bae6f293ab7e3">
   <xsd:schema xmlns:xsd="http://www.w3.org/2001/XMLSchema" xmlns:xs="http://www.w3.org/2001/XMLSchema" xmlns:p="http://schemas.microsoft.com/office/2006/metadata/properties" xmlns:ns3="e5940136-3a96-421c-8544-2602b63fadb2" xmlns:ns4="603fee5e-28e9-4833-90f2-2198a9b0afab" targetNamespace="http://schemas.microsoft.com/office/2006/metadata/properties" ma:root="true" ma:fieldsID="f0f063de366a514fc7288ddfce6cb56e" ns3:_="" ns4:_="">
     <xsd:import namespace="e5940136-3a96-421c-8544-2602b63fadb2"/>
@@ -5947,24 +5980,25 @@
 </ct:contentTypeSchema>
 </file>
 
-<file path=customXml/item2.xml><?xml version="1.0" encoding="utf-8"?>
-<p:properties xmlns:p="http://schemas.microsoft.com/office/2006/metadata/properties" xmlns:xsi="http://www.w3.org/2001/XMLSchema-instance" xmlns:pc="http://schemas.microsoft.com/office/infopath/2007/PartnerControls">
-  <documentManagement>
-    <_activity xmlns="e5940136-3a96-421c-8544-2602b63fadb2" xsi:nil="true"/>
-  </documentManagement>
-</p:properties>
+<file path=customXml/itemProps1.xml><?xml version="1.0" encoding="utf-8"?>
+<ds:datastoreItem xmlns:ds="http://schemas.openxmlformats.org/officeDocument/2006/customXml" ds:itemID="{B9CAFD49-3137-422A-92B3-6174F06E0AFF}">
+  <ds:schemaRefs>
+    <ds:schemaRef ds:uri="http://schemas.microsoft.com/sharepoint/v3/contenttype/forms"/>
+  </ds:schemaRefs>
+</ds:datastoreItem>
 </file>
 
-<file path=customXml/item3.xml><?xml version="1.0" encoding="utf-8"?>
-<?mso-contentType ?>
-<FormTemplates xmlns="http://schemas.microsoft.com/sharepoint/v3/contenttype/forms">
-  <Display>DocumentLibraryForm</Display>
-  <Edit>DocumentLibraryForm</Edit>
-  <New>DocumentLibraryForm</New>
-</FormTemplates>
+<file path=customXml/itemProps2.xml><?xml version="1.0" encoding="utf-8"?>
+<ds:datastoreItem xmlns:ds="http://schemas.openxmlformats.org/officeDocument/2006/customXml" ds:itemID="{A73F9857-B3DA-4DEA-8450-8992A1BB3E61}">
+  <ds:schemaRefs>
+    <ds:schemaRef ds:uri="http://schemas.microsoft.com/office/2006/metadata/properties"/>
+    <ds:schemaRef ds:uri="http://schemas.microsoft.com/office/infopath/2007/PartnerControls"/>
+    <ds:schemaRef ds:uri="e5940136-3a96-421c-8544-2602b63fadb2"/>
+  </ds:schemaRefs>
+</ds:datastoreItem>
 </file>
 
-<file path=customXml/itemProps1.xml><?xml version="1.0" encoding="utf-8"?>
+<file path=customXml/itemProps3.xml><?xml version="1.0" encoding="utf-8"?>
 <ds:datastoreItem xmlns:ds="http://schemas.openxmlformats.org/officeDocument/2006/customXml" ds:itemID="{12FA4345-A46E-48CF-977D-544BE2E59AF4}">
   <ds:schemaRefs>
     <ds:schemaRef ds:uri="http://schemas.microsoft.com/office/2006/metadata/contentType"/>
@@ -5981,29 +6015,4 @@
     <ds:schemaRef ds:uri="http://schemas.microsoft.com/internal/obd"/>
   </ds:schemaRefs>
 </ds:datastoreItem>
-</file>
-
-<file path=customXml/itemProps2.xml><?xml version="1.0" encoding="utf-8"?>
-<ds:datastoreItem xmlns:ds="http://schemas.openxmlformats.org/officeDocument/2006/customXml" ds:itemID="{A73F9857-B3DA-4DEA-8450-8992A1BB3E61}">
-  <ds:schemaRefs>
-    <ds:schemaRef ds:uri="http://purl.org/dc/terms/"/>
-    <ds:schemaRef ds:uri="e5940136-3a96-421c-8544-2602b63fadb2"/>
-    <ds:schemaRef ds:uri="603fee5e-28e9-4833-90f2-2198a9b0afab"/>
-    <ds:schemaRef ds:uri="http://schemas.microsoft.com/office/2006/metadata/properties"/>
-    <ds:schemaRef ds:uri="http://schemas.microsoft.com/office/infopath/2007/PartnerControls"/>
-    <ds:schemaRef ds:uri="http://purl.org/dc/elements/1.1/"/>
-    <ds:schemaRef ds:uri="http://schemas.microsoft.com/office/2006/documentManagement/types"/>
-    <ds:schemaRef ds:uri="http://schemas.openxmlformats.org/package/2006/metadata/core-properties"/>
-    <ds:schemaRef ds:uri="http://www.w3.org/XML/1998/namespace"/>
-    <ds:schemaRef ds:uri="http://purl.org/dc/dcmitype/"/>
-  </ds:schemaRefs>
-</ds:datastoreItem>
-</file>
-
-<file path=customXml/itemProps3.xml><?xml version="1.0" encoding="utf-8"?>
-<ds:datastoreItem xmlns:ds="http://schemas.openxmlformats.org/officeDocument/2006/customXml" ds:itemID="{B9CAFD49-3137-422A-92B3-6174F06E0AFF}">
-  <ds:schemaRefs>
-    <ds:schemaRef ds:uri="http://schemas.microsoft.com/sharepoint/v3/contenttype/forms"/>
-  </ds:schemaRefs>
-</ds:datastoreItem>
 </file>
</xml_diff>